<commit_message>
Reset the repository to the headless Vendure and Frappe bridge baseline.
Co-authored-by: Cursor <cursoragent@cursor.com>
</commit_message>
<xml_diff>
--- a/specs/phases/Supercore Commerce OS — Phase 0 Completion Audit v1.0.docx
+++ b/specs/phases/Supercore Commerce OS — Phase 0 Completion Audit v1.0.docx
@@ -37,13 +37,13 @@
     </w:p>
     <w:p>
       <w:r>
-        <w:t xml:space="preserve">Remote CI: not independently confirmed. .github/workflows/ci.yml exists; it triggers on main while this repository’s default branch is master.</w:t>
-      </w:r>
-    </w:p>
-    <w:p/>
-    <w:p>
-      <w:r>
-        <w:t xml:space="preserve">Next implementation phase is Phase 1 — Platform Core, only after that specification is approved. That condition is the approval gate, not a contradiction.</w:t>
+        <w:t xml:space="preserve">Remote CI: [Actions run 37339984665](https://github.com/SCore-ai/supercorecommerceos/actions/runs/37339984665) succeeded on master for a0d709f (2026-10-05). That commit points the workflow at master and contains Phase 1 code from 7de6c75. 7de6c75 itself has no run; the previous workflow listened to main.</w:t>
+      </w:r>
+    </w:p>
+    <w:p/>
+    <w:p>
+      <w:r>
+        <w:t xml:space="preserve">Phase 1 Platform Core code is on master at 7de6c75. This file remains the Phase 0 report. It is not approval to start Phase 2.</w:t>
       </w:r>
     </w:p>
     <w:p/>
@@ -895,7 +895,7 @@
           </w:tcPr>
           <w:p>
             <w:r>
-              <w:t xml:space="preserve">Workflow file present (`.github/workflows/ci.yml`). Live run on `master` not confirmed.</w:t>
+              <w:t xml:space="preserve">Done. Push trigger is `master`. [Run 37339984665](https://github.com/SCore-ai/supercorecommerceos/actions/runs/37339984665) succeeded for `a0d709f`.</w:t>
             </w:r>
           </w:p>
         </w:tc>
@@ -1196,24 +1196,24 @@
     <w:p/>
     <w:p>
       <w:r>
-        <w:t xml:space="preserve">Remote / evidence still pending:</w:t>
-      </w:r>
-    </w:p>
-    <w:p/>
-    <w:p>
-      <w:pPr>
-        <w:pStyle w:val="ListBullet"/>
-      </w:pPr>
-      <w:r>
-        <w:t xml:space="preserve">GitHub Actions run URL and SHA for this repository</w:t>
-      </w:r>
-    </w:p>
-    <w:p>
-      <w:pPr>
-        <w:pStyle w:val="ListBullet"/>
-      </w:pPr>
-      <w:r>
-        <w:t xml:space="preserve">Immutable command logs bound to a commit</w:t>
+        <w:t xml:space="preserve">Remote (bound 2026-10-05):</w:t>
+      </w:r>
+    </w:p>
+    <w:p/>
+    <w:p>
+      <w:pPr>
+        <w:pStyle w:val="ListBullet"/>
+      </w:pPr>
+      <w:r>
+        <w:t xml:space="preserve">GitHub Actions run [37339984665](https://github.com/SCore-ai/supercorecommerceos/actions/runs/37339984665) succeeded for `a0d709f` on `master`</w:t>
+      </w:r>
+    </w:p>
+    <w:p>
+      <w:pPr>
+        <w:pStyle w:val="ListBullet"/>
+      </w:pPr>
+      <w:r>
+        <w:t xml:space="preserve">That run is the command log for the close-out commit (lint, typecheck, unit, migrate, integration, build)</w:t>
       </w:r>
     </w:p>
     <w:p/>
@@ -1252,7 +1252,7 @@
         <w:pStyle w:val="ListBullet"/>
       </w:pPr>
       <w:r>
-        <w:t xml:space="preserve">Auth is an interface, not a complete identity product (Phase 1)</w:t>
+        <w:t xml:space="preserve">Auth was an interface in Phase 0. Phase 1 implemented first-party auth at `7de6c75`.</w:t>
       </w:r>
     </w:p>
     <w:p>
@@ -1268,7 +1268,7 @@
         <w:pStyle w:val="ListBullet"/>
       </w:pPr>
       <w:r>
-        <w:t xml:space="preserve">Live GitHub Actions run should be confirmed on the remote after push</w:t>
+        <w:t xml:space="preserve">Live GitHub Actions on `master` is run 37339984665 for `a0d709f`</w:t>
       </w:r>
     </w:p>
     <w:p/>
@@ -1528,13 +1528,13 @@
     <w:p/>
     <w:p>
       <w:r>
-        <w:t xml:space="preserve">Phase 0 coding matches the Bootstrap Master Prompt Definition of Done as a local report. Treat it as complete for foundation scope once a later evidence pass binds logs and remote CI to a commit. Do not treat “CI file present” as “CI passed”.</w:t>
-      </w:r>
-    </w:p>
-    <w:p/>
-    <w:p>
-      <w:r>
-        <w:t xml:space="preserve">Next implementation phase is Phase 1 — Platform Core, after that spec is approved.</w:t>
+        <w:t xml:space="preserve">Phase 0 coding matches the Bootstrap Master Prompt Definition of Done as a local report, and remote CI is now bound to a0d709f (run 37339984665). Do not treat an earlier “CI file present” note as that run.</w:t>
+      </w:r>
+    </w:p>
+    <w:p/>
+    <w:p>
+      <w:r>
+        <w:t xml:space="preserve">Phase 1 Platform Core is implemented at 7de6c75. Phase 2 still needs an approved addendum. Do not start Phase 2 code from this audit.</w:t>
       </w:r>
     </w:p>
     <w:p/>

</xml_diff>